<commit_message>
version 0.0.18 exporting docx
</commit_message>
<xml_diff>
--- a/apps/facture/static/facture/file_templates/file_input/Facture_template_Maroc.docx
+++ b/apps/facture/static/facture/file_templates/file_input/Facture_template_Maroc.docx
@@ -44,6 +44,59 @@
                 <w:szCs w:val="16"/>
               </w:rPr>
             </w:pPr>
+          </w:p>
+        </w:tc>
+        <w:tc>
+          <w:tcPr>
+            <w:tcW w:w="4696" w:type="dxa"/>
+            <w:shd w:val="clear" w:color="auto" w:fill="auto"/>
+          </w:tcPr>
+          <w:p>
+            <w:pPr>
+              <w:pStyle w:val="LO-normal"/>
+              <w:tabs>
+                <w:tab w:val="left" w:pos="2812"/>
+              </w:tabs>
+              <w:ind w:left="180" w:right="2160"/>
+              <w:rPr>
+                <w:rFonts w:ascii="Arial" w:eastAsia="Arial" w:hAnsi="Arial" w:cs="Arial"/>
+                <w:color w:val="000000"/>
+                <w:sz w:val="16"/>
+                <w:szCs w:val="16"/>
+              </w:rPr>
+            </w:pPr>
+            <w:r>
+              <w:rPr>
+                <w:rFonts w:ascii="Arial" w:eastAsia="Arial" w:hAnsi="Arial" w:cs="Arial"/>
+                <w:color w:val="000000"/>
+                <w:sz w:val="16"/>
+                <w:szCs w:val="16"/>
+              </w:rPr>
+              <w:t xml:space="preserve">                                </w:t>
+            </w:r>
+          </w:p>
+        </w:tc>
+      </w:tr>
+      <w:tr>
+        <w:trPr>
+          <w:trHeight w:val="1609"/>
+        </w:trPr>
+        <w:tc>
+          <w:tcPr>
+            <w:tcW w:w="6385" w:type="dxa"/>
+            <w:shd w:val="clear" w:color="auto" w:fill="auto"/>
+          </w:tcPr>
+          <w:p>
+            <w:pPr>
+              <w:pStyle w:val="LO-normal"/>
+              <w:spacing w:after="120"/>
+              <w:rPr>
+                <w:rFonts w:eastAsia="Times New Roman" w:cs="Times New Roman"/>
+                <w:color w:val="000000"/>
+                <w:sz w:val="8"/>
+                <w:szCs w:val="8"/>
+              </w:rPr>
+            </w:pPr>
             <w:r>
               <w:rPr>
                 <w:rFonts w:eastAsia="Times New Roman" w:cs="Times New Roman"/>
@@ -55,18 +108,18 @@
               <mc:AlternateContent>
                 <mc:Choice Requires="wps">
                   <w:drawing>
-                    <wp:anchor distT="6985" distB="6985" distL="6985" distR="6985" simplePos="0" relativeHeight="10" behindDoc="0" locked="0" layoutInCell="0" allowOverlap="1">
+                    <wp:anchor distT="6985" distB="6985" distL="6985" distR="6985" simplePos="0" relativeHeight="251659264" behindDoc="0" locked="0" layoutInCell="0" allowOverlap="1" wp14:anchorId="7B12CB09" wp14:editId="1B04067E">
                       <wp:simplePos x="0" y="0"/>
                       <wp:positionH relativeFrom="column">
-                        <wp:posOffset>4009873</wp:posOffset>
+                        <wp:posOffset>8825</wp:posOffset>
                       </wp:positionH>
                       <wp:positionV relativeFrom="paragraph">
-                        <wp:posOffset>406856</wp:posOffset>
+                        <wp:posOffset>79893</wp:posOffset>
                       </wp:positionV>
-                      <wp:extent cx="2944440" cy="687959"/>
-                      <wp:effectExtent l="0" t="0" r="15240" b="10795"/>
+                      <wp:extent cx="3909527" cy="821094"/>
+                      <wp:effectExtent l="0" t="0" r="15240" b="17145"/>
                       <wp:wrapNone/>
-                      <wp:docPr id="2" name="Shape 1"/>
+                      <wp:docPr id="1238232136" name="Shape 1"/>
                       <wp:cNvGraphicFramePr/>
                       <a:graphic xmlns:a="http://schemas.openxmlformats.org/drawingml/2006/main">
                         <a:graphicData uri="http://schemas.microsoft.com/office/word/2010/wordprocessingShape">
@@ -75,7 +128,7 @@
                             <wps:spPr>
                               <a:xfrm>
                                 <a:off x="0" y="0"/>
-                                <a:ext cx="2944440" cy="687959"/>
+                                <a:ext cx="3909527" cy="821094"/>
                               </a:xfrm>
                               <a:prstGeom prst="roundRect">
                                 <a:avLst>
@@ -106,6 +159,9 @@
                           </wps:wsp>
                         </a:graphicData>
                       </a:graphic>
+                      <wp14:sizeRelH relativeFrom="margin">
+                        <wp14:pctWidth>0</wp14:pctWidth>
+                      </wp14:sizeRelH>
                       <wp14:sizeRelV relativeFrom="margin">
                         <wp14:pctHeight>0</wp14:pctHeight>
                       </wp14:sizeRelV>
@@ -114,64 +170,11 @@
                 </mc:Choice>
                 <mc:Fallback>
                   <w:pict>
-                    <v:roundrect w14:anchorId="73F2F50A" id="Shape 1" o:spid="_x0000_s1026" style="position:absolute;margin-left:315.75pt;margin-top:32.05pt;width:231.85pt;height:54.15pt;z-index:10;visibility:visible;mso-wrap-style:square;mso-height-percent:0;mso-wrap-distance-left:.55pt;mso-wrap-distance-top:.55pt;mso-wrap-distance-right:.55pt;mso-wrap-distance-bottom:.55pt;mso-position-horizontal:absolute;mso-position-horizontal-relative:text;mso-position-vertical:absolute;mso-position-vertical-relative:text;mso-height-percent:0;mso-height-relative:margin;v-text-anchor:top" arcsize="10923f" o:gfxdata="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" o:allowincell="f" filled="f" strokeweight=".35mm"/>
+                    <v:roundrect w14:anchorId="1301AAED" id="Shape 1" o:spid="_x0000_s1026" style="position:absolute;margin-left:.7pt;margin-top:6.3pt;width:307.85pt;height:64.65pt;z-index:251659264;visibility:visible;mso-wrap-style:square;mso-width-percent:0;mso-height-percent:0;mso-wrap-distance-left:.55pt;mso-wrap-distance-top:.55pt;mso-wrap-distance-right:.55pt;mso-wrap-distance-bottom:.55pt;mso-position-horizontal:absolute;mso-position-horizontal-relative:text;mso-position-vertical:absolute;mso-position-vertical-relative:text;mso-width-percent:0;mso-height-percent:0;mso-width-relative:margin;mso-height-relative:margin;v-text-anchor:top" arcsize="10923f" o:gfxdata="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" o:allowincell="f" filled="f" strokeweight=".35mm"/>
                   </w:pict>
                 </mc:Fallback>
               </mc:AlternateContent>
             </w:r>
-          </w:p>
-        </w:tc>
-        <w:tc>
-          <w:tcPr>
-            <w:tcW w:w="4696" w:type="dxa"/>
-            <w:shd w:val="clear" w:color="auto" w:fill="auto"/>
-          </w:tcPr>
-          <w:p>
-            <w:pPr>
-              <w:pStyle w:val="LO-normal"/>
-              <w:tabs>
-                <w:tab w:val="left" w:pos="2812"/>
-              </w:tabs>
-              <w:ind w:left="180" w:right="2160"/>
-              <w:rPr>
-                <w:rFonts w:ascii="Arial" w:eastAsia="Arial" w:hAnsi="Arial" w:cs="Arial"/>
-                <w:color w:val="000000"/>
-                <w:sz w:val="16"/>
-                <w:szCs w:val="16"/>
-              </w:rPr>
-            </w:pPr>
-            <w:r>
-              <w:rPr>
-                <w:rFonts w:ascii="Arial" w:eastAsia="Arial" w:hAnsi="Arial" w:cs="Arial"/>
-                <w:color w:val="000000"/>
-                <w:sz w:val="16"/>
-                <w:szCs w:val="16"/>
-              </w:rPr>
-              <w:t xml:space="preserve">                                </w:t>
-            </w:r>
-          </w:p>
-        </w:tc>
-      </w:tr>
-      <w:tr>
-        <w:trPr>
-          <w:trHeight w:val="1609"/>
-        </w:trPr>
-        <w:tc>
-          <w:tcPr>
-            <w:tcW w:w="6385" w:type="dxa"/>
-            <w:shd w:val="clear" w:color="auto" w:fill="auto"/>
-          </w:tcPr>
-          <w:p>
-            <w:pPr>
-              <w:pStyle w:val="LO-normal"/>
-              <w:spacing w:after="120"/>
-              <w:rPr>
-                <w:rFonts w:eastAsia="Times New Roman" w:cs="Times New Roman"/>
-                <w:color w:val="000000"/>
-                <w:sz w:val="8"/>
-                <w:szCs w:val="8"/>
-              </w:rPr>
-            </w:pPr>
           </w:p>
           <w:tbl>
             <w:tblPr>
@@ -425,392 +428,6 @@
             <w:r>
               <w:rPr>
                 <w:rFonts w:eastAsia="Times New Roman" w:cs="Times New Roman"/>
-                <w:color w:val="000000"/>
-              </w:rPr>
-              <w:t xml:space="preserve">                                       </w:t>
-            </w:r>
-          </w:p>
-          <w:p>
-            <w:pPr>
-              <w:pStyle w:val="LO-normal"/>
-              <w:rPr>
-                <w:rFonts w:eastAsia="Times New Roman" w:cs="Times New Roman"/>
-                <w:color w:val="000000"/>
-              </w:rPr>
-            </w:pPr>
-            <w:r>
-              <w:rPr>
-                <w:rFonts w:eastAsia="Times New Roman" w:cs="Times New Roman"/>
-                <w:color w:val="000000"/>
-              </w:rPr>
-              <w:t xml:space="preserve">        </w:t>
-            </w:r>
-          </w:p>
-          <w:p>
-            <w:pPr>
-              <w:pStyle w:val="LO-normal"/>
-              <w:rPr>
-                <w:rFonts w:eastAsia="Times New Roman" w:cs="Times New Roman"/>
-                <w:color w:val="000000"/>
-              </w:rPr>
-            </w:pPr>
-            <w:r>
-              <w:rPr>
-                <w:rFonts w:eastAsia="Times New Roman" w:cs="Times New Roman"/>
-                <w:color w:val="000000"/>
-              </w:rPr>
-              <w:t xml:space="preserve">    </w:t>
-            </w:r>
-            <w:proofErr w:type="spellStart"/>
-            <w:r>
-              <w:rPr>
-                <w:rFonts w:eastAsia="Times New Roman" w:cs="Times New Roman"/>
-                <w:color w:val="000000"/>
-              </w:rPr>
-              <w:t>firm_name</w:t>
-            </w:r>
-            <w:proofErr w:type="spellEnd"/>
-          </w:p>
-          <w:p>
-            <w:pPr>
-              <w:pStyle w:val="LO-normal"/>
-              <w:rPr>
-                <w:rFonts w:eastAsia="Times New Roman" w:cs="Times New Roman"/>
-                <w:color w:val="000000"/>
-              </w:rPr>
-            </w:pPr>
-            <w:r>
-              <w:rPr>
-                <w:rFonts w:eastAsia="Times New Roman" w:cs="Times New Roman"/>
-                <w:color w:val="000000"/>
-              </w:rPr>
-              <w:t xml:space="preserve">    address</w:t>
-            </w:r>
-          </w:p>
-          <w:p>
-            <w:pPr>
-              <w:pStyle w:val="LO-normal"/>
-              <w:rPr>
-                <w:rFonts w:eastAsia="Times New Roman" w:cs="Times New Roman"/>
-                <w:color w:val="000000"/>
-              </w:rPr>
-            </w:pPr>
-          </w:p>
-          <w:p>
-            <w:pPr>
-              <w:pStyle w:val="LO-normal"/>
-              <w:rPr>
-                <w:rFonts w:eastAsia="Times New Roman" w:cs="Times New Roman"/>
-                <w:color w:val="000000"/>
-              </w:rPr>
-            </w:pPr>
-            <w:r>
-              <w:rPr>
-                <w:rFonts w:eastAsia="Times New Roman" w:cs="Times New Roman"/>
-                <w:color w:val="000000"/>
-              </w:rPr>
-              <w:t xml:space="preserve">                           </w:t>
-            </w:r>
-          </w:p>
-        </w:tc>
-      </w:tr>
-    </w:tbl>
-    <w:p>
-      <w:pPr>
-        <w:pStyle w:val="LO-normal"/>
-        <w:spacing w:after="120"/>
-        <w:rPr>
-          <w:rFonts w:eastAsia="Times New Roman" w:cs="Times New Roman"/>
-          <w:color w:val="000000"/>
-          <w:sz w:val="4"/>
-          <w:szCs w:val="4"/>
-        </w:rPr>
-      </w:pPr>
-    </w:p>
-    <w:tbl>
-      <w:tblPr>
-        <w:tblW w:w="11111" w:type="dxa"/>
-        <w:tblInd w:w="-771" w:type="dxa"/>
-        <w:tblLayout w:type="fixed"/>
-        <w:tblLook w:val="0000" w:firstRow="0" w:lastRow="0" w:firstColumn="0" w:lastColumn="0" w:noHBand="0" w:noVBand="0"/>
-      </w:tblPr>
-      <w:tblGrid>
-        <w:gridCol w:w="1685"/>
-        <w:gridCol w:w="2772"/>
-        <w:gridCol w:w="2410"/>
-        <w:gridCol w:w="1842"/>
-        <w:gridCol w:w="2402"/>
-      </w:tblGrid>
-      <w:tr>
-        <w:trPr>
-          <w:trHeight w:val="360"/>
-        </w:trPr>
-        <w:tc>
-          <w:tcPr>
-            <w:tcW w:w="1685" w:type="dxa"/>
-            <w:tcBorders>
-              <w:bottom w:val="single" w:sz="8" w:space="0" w:color="000000"/>
-            </w:tcBorders>
-            <w:shd w:val="clear" w:color="auto" w:fill="auto"/>
-            <w:vAlign w:val="center"/>
-          </w:tcPr>
-          <w:p>
-            <w:pPr>
-              <w:pStyle w:val="LO-normal"/>
-              <w:jc w:val="center"/>
-              <w:rPr>
-                <w:rFonts w:ascii="Arial" w:eastAsia="Arial" w:hAnsi="Arial" w:cs="Arial"/>
-                <w:color w:val="000000"/>
-                <w:sz w:val="16"/>
-                <w:szCs w:val="16"/>
-              </w:rPr>
-            </w:pPr>
-            <w:proofErr w:type="spellStart"/>
-            <w:r>
-              <w:rPr>
-                <w:rFonts w:ascii="Arial" w:eastAsia="Arial" w:hAnsi="Arial" w:cs="Arial"/>
-                <w:color w:val="000000"/>
-                <w:sz w:val="16"/>
-                <w:szCs w:val="16"/>
-              </w:rPr>
-              <w:t>Référence</w:t>
-            </w:r>
-            <w:proofErr w:type="spellEnd"/>
-          </w:p>
-        </w:tc>
-        <w:tc>
-          <w:tcPr>
-            <w:tcW w:w="2772" w:type="dxa"/>
-            <w:tcBorders>
-              <w:left w:val="single" w:sz="8" w:space="0" w:color="000000"/>
-              <w:bottom w:val="single" w:sz="8" w:space="0" w:color="000000"/>
-            </w:tcBorders>
-            <w:shd w:val="clear" w:color="auto" w:fill="auto"/>
-            <w:vAlign w:val="center"/>
-          </w:tcPr>
-          <w:p>
-            <w:pPr>
-              <w:pStyle w:val="LO-normal"/>
-              <w:jc w:val="center"/>
-              <w:rPr>
-                <w:rFonts w:ascii="Arial" w:eastAsia="Arial" w:hAnsi="Arial" w:cs="Arial"/>
-                <w:color w:val="000000"/>
-                <w:sz w:val="16"/>
-                <w:szCs w:val="16"/>
-              </w:rPr>
-            </w:pPr>
-            <w:proofErr w:type="spellStart"/>
-            <w:r>
-              <w:rPr>
-                <w:rFonts w:ascii="Arial" w:eastAsia="Arial" w:hAnsi="Arial" w:cs="Arial"/>
-                <w:color w:val="000000"/>
-                <w:sz w:val="16"/>
-                <w:szCs w:val="16"/>
-              </w:rPr>
-              <w:t>Désignation</w:t>
-            </w:r>
-            <w:proofErr w:type="spellEnd"/>
-          </w:p>
-        </w:tc>
-        <w:tc>
-          <w:tcPr>
-            <w:tcW w:w="2410" w:type="dxa"/>
-            <w:tcBorders>
-              <w:left w:val="single" w:sz="8" w:space="0" w:color="000000"/>
-              <w:bottom w:val="single" w:sz="8" w:space="0" w:color="000000"/>
-            </w:tcBorders>
-            <w:shd w:val="clear" w:color="auto" w:fill="auto"/>
-            <w:vAlign w:val="center"/>
-          </w:tcPr>
-          <w:p>
-            <w:pPr>
-              <w:pStyle w:val="LO-normal"/>
-              <w:jc w:val="center"/>
-              <w:rPr>
-                <w:rFonts w:ascii="Arial" w:eastAsia="Arial" w:hAnsi="Arial" w:cs="Arial"/>
-                <w:color w:val="000000"/>
-                <w:sz w:val="16"/>
-                <w:szCs w:val="16"/>
-              </w:rPr>
-            </w:pPr>
-            <w:proofErr w:type="spellStart"/>
-            <w:r>
-              <w:rPr>
-                <w:rFonts w:ascii="Arial" w:eastAsia="Arial" w:hAnsi="Arial" w:cs="Arial"/>
-                <w:color w:val="000000"/>
-                <w:sz w:val="16"/>
-                <w:szCs w:val="16"/>
-              </w:rPr>
-              <w:t>Quantit</w:t>
-            </w:r>
-            <w:r>
-              <w:rPr>
-                <w:rFonts w:ascii="Verdana" w:eastAsia="Verdana" w:hAnsi="Verdana" w:cs="Verdana"/>
-                <w:color w:val="000000"/>
-                <w:sz w:val="16"/>
-                <w:szCs w:val="16"/>
-              </w:rPr>
-              <w:t>é</w:t>
-            </w:r>
-            <w:proofErr w:type="spellEnd"/>
-          </w:p>
-        </w:tc>
-        <w:tc>
-          <w:tcPr>
-            <w:tcW w:w="1842" w:type="dxa"/>
-            <w:tcBorders>
-              <w:left w:val="single" w:sz="8" w:space="0" w:color="000000"/>
-              <w:bottom w:val="single" w:sz="8" w:space="0" w:color="000000"/>
-            </w:tcBorders>
-            <w:shd w:val="clear" w:color="auto" w:fill="auto"/>
-            <w:vAlign w:val="center"/>
-          </w:tcPr>
-          <w:p>
-            <w:pPr>
-              <w:pStyle w:val="LO-normal"/>
-              <w:jc w:val="center"/>
-              <w:rPr>
-                <w:rFonts w:ascii="Arial" w:eastAsia="Arial" w:hAnsi="Arial" w:cs="Arial"/>
-                <w:color w:val="000000"/>
-                <w:sz w:val="16"/>
-                <w:szCs w:val="16"/>
-              </w:rPr>
-            </w:pPr>
-            <w:r>
-              <w:rPr>
-                <w:rFonts w:ascii="Arial" w:eastAsia="Arial" w:hAnsi="Arial" w:cs="Arial"/>
-                <w:color w:val="000000"/>
-                <w:sz w:val="16"/>
-                <w:szCs w:val="16"/>
-              </w:rPr>
-              <w:t>P.U.TTC</w:t>
-            </w:r>
-          </w:p>
-        </w:tc>
-        <w:tc>
-          <w:tcPr>
-            <w:tcW w:w="2402" w:type="dxa"/>
-            <w:tcBorders>
-              <w:left w:val="single" w:sz="8" w:space="0" w:color="000000"/>
-              <w:bottom w:val="single" w:sz="8" w:space="0" w:color="000000"/>
-            </w:tcBorders>
-            <w:shd w:val="clear" w:color="auto" w:fill="auto"/>
-            <w:vAlign w:val="center"/>
-          </w:tcPr>
-          <w:p>
-            <w:pPr>
-              <w:pStyle w:val="LO-normal"/>
-              <w:jc w:val="center"/>
-              <w:rPr>
-                <w:rFonts w:ascii="Arial" w:eastAsia="Arial" w:hAnsi="Arial" w:cs="Arial"/>
-                <w:color w:val="000000"/>
-                <w:sz w:val="16"/>
-                <w:szCs w:val="16"/>
-              </w:rPr>
-            </w:pPr>
-            <w:proofErr w:type="spellStart"/>
-            <w:r>
-              <w:rPr>
-                <w:rFonts w:ascii="Arial" w:eastAsia="Arial" w:hAnsi="Arial" w:cs="Arial"/>
-                <w:color w:val="000000"/>
-                <w:sz w:val="16"/>
-                <w:szCs w:val="16"/>
-              </w:rPr>
-              <w:t>Montant</w:t>
-            </w:r>
-            <w:proofErr w:type="spellEnd"/>
-          </w:p>
-        </w:tc>
-      </w:tr>
-      <w:tr>
-        <w:trPr>
-          <w:trHeight w:val="8460"/>
-        </w:trPr>
-        <w:tc>
-          <w:tcPr>
-            <w:tcW w:w="1685" w:type="dxa"/>
-            <w:tcBorders>
-              <w:top w:val="single" w:sz="8" w:space="0" w:color="000000"/>
-              <w:bottom w:val="single" w:sz="8" w:space="0" w:color="000000"/>
-            </w:tcBorders>
-            <w:shd w:val="clear" w:color="auto" w:fill="auto"/>
-          </w:tcPr>
-          <w:p>
-            <w:pPr>
-              <w:pStyle w:val="LO-normal"/>
-              <w:jc w:val="center"/>
-              <w:rPr>
-                <w:rFonts w:ascii="Arial" w:eastAsia="Arial" w:hAnsi="Arial" w:cs="Arial"/>
-                <w:color w:val="000000"/>
-                <w:sz w:val="20"/>
-                <w:szCs w:val="20"/>
-              </w:rPr>
-            </w:pPr>
-            <w:r>
-              <w:rPr>
-                <w:rFonts w:ascii="Arial" w:eastAsia="Arial" w:hAnsi="Arial" w:cs="Arial"/>
-                <w:sz w:val="20"/>
-                <w:szCs w:val="20"/>
-              </w:rPr>
-              <w:t>reference</w:t>
-            </w:r>
-          </w:p>
-        </w:tc>
-        <w:tc>
-          <w:tcPr>
-            <w:tcW w:w="2772" w:type="dxa"/>
-            <w:tcBorders>
-              <w:top w:val="single" w:sz="8" w:space="0" w:color="000000"/>
-              <w:left w:val="single" w:sz="8" w:space="0" w:color="000000"/>
-              <w:bottom w:val="single" w:sz="8" w:space="0" w:color="000000"/>
-            </w:tcBorders>
-            <w:shd w:val="clear" w:color="auto" w:fill="auto"/>
-          </w:tcPr>
-          <w:p>
-            <w:pPr>
-              <w:pStyle w:val="LO-normal"/>
-              <w:jc w:val="center"/>
-              <w:rPr>
-                <w:rFonts w:ascii="Arial" w:eastAsia="Arial" w:hAnsi="Arial" w:cs="Arial"/>
-                <w:color w:val="000000"/>
-                <w:sz w:val="20"/>
-                <w:szCs w:val="20"/>
-              </w:rPr>
-            </w:pPr>
-            <w:r>
-              <w:rPr>
-                <w:rFonts w:ascii="Arial" w:eastAsia="Arial" w:hAnsi="Arial" w:cs="Arial"/>
-                <w:sz w:val="20"/>
-                <w:szCs w:val="20"/>
-              </w:rPr>
-              <w:t>destination</w:t>
-            </w:r>
-          </w:p>
-        </w:tc>
-        <w:tc>
-          <w:tcPr>
-            <w:tcW w:w="2410" w:type="dxa"/>
-            <w:tcBorders>
-              <w:top w:val="single" w:sz="8" w:space="0" w:color="000000"/>
-              <w:left w:val="single" w:sz="8" w:space="0" w:color="000000"/>
-              <w:bottom w:val="single" w:sz="8" w:space="0" w:color="000000"/>
-            </w:tcBorders>
-            <w:shd w:val="clear" w:color="auto" w:fill="auto"/>
-          </w:tcPr>
-          <w:p>
-            <w:pPr>
-              <w:pStyle w:val="LO-normal"/>
-              <w:jc w:val="center"/>
-              <w:rPr>
-                <w:rFonts w:ascii="Arial" w:eastAsia="Arial" w:hAnsi="Arial" w:cs="Arial"/>
-                <w:color w:val="000000"/>
-                <w:sz w:val="20"/>
-                <w:szCs w:val="20"/>
-              </w:rPr>
-            </w:pPr>
-            <w:r>
-              <w:rPr>
-                <w:rFonts w:eastAsia="Times New Roman" w:cs="Times New Roman"/>
                 <w:noProof/>
                 <w:color w:val="000000"/>
                 <w:sz w:val="16"/>
@@ -819,18 +436,18 @@
               <mc:AlternateContent>
                 <mc:Choice Requires="wps">
                   <w:drawing>
-                    <wp:anchor distT="6985" distB="6985" distL="6985" distR="6985" simplePos="0" relativeHeight="9" behindDoc="0" locked="0" layoutInCell="0" allowOverlap="1" wp14:anchorId="7D4F80B1">
+                    <wp:anchor distT="6985" distB="6985" distL="6985" distR="6985" simplePos="0" relativeHeight="10" behindDoc="0" locked="0" layoutInCell="0" allowOverlap="1">
                       <wp:simplePos x="0" y="0"/>
                       <wp:positionH relativeFrom="column">
-                        <wp:posOffset>-2858692</wp:posOffset>
+                        <wp:posOffset>-2540</wp:posOffset>
                       </wp:positionH>
                       <wp:positionV relativeFrom="paragraph">
-                        <wp:posOffset>-1299715</wp:posOffset>
+                        <wp:posOffset>157480</wp:posOffset>
                       </wp:positionV>
-                      <wp:extent cx="3944620" cy="753019"/>
-                      <wp:effectExtent l="0" t="0" r="17780" b="9525"/>
+                      <wp:extent cx="2943860" cy="687705"/>
+                      <wp:effectExtent l="0" t="0" r="15240" b="10795"/>
                       <wp:wrapNone/>
-                      <wp:docPr id="1" name="Shape 4"/>
+                      <wp:docPr id="2" name="Shape 1"/>
                       <wp:cNvGraphicFramePr/>
                       <a:graphic xmlns:a="http://schemas.openxmlformats.org/drawingml/2006/main">
                         <a:graphicData uri="http://schemas.microsoft.com/office/word/2010/wordprocessingShape">
@@ -839,7 +456,7 @@
                             <wps:spPr>
                               <a:xfrm>
                                 <a:off x="0" y="0"/>
-                                <a:ext cx="3944620" cy="753019"/>
+                                <a:ext cx="2943860" cy="687705"/>
                               </a:xfrm>
                               <a:prstGeom prst="roundRect">
                                 <a:avLst>
@@ -866,23 +483,13 @@
                               </a:effectRef>
                               <a:fontRef idx="minor"/>
                             </wps:style>
-                            <wps:txbx>
-                              <w:txbxContent>
-                                <w:p>
-                                  <w:pPr>
-                                    <w:rPr>
-                                      <w:lang w:val="en-US"/>
-                                    </w:rPr>
-                                  </w:pPr>
-                                </w:p>
-                              </w:txbxContent>
-                            </wps:txbx>
-                            <wps:bodyPr>
-                              <a:noAutofit/>
-                            </wps:bodyPr>
+                            <wps:bodyPr/>
                           </wps:wsp>
                         </a:graphicData>
                       </a:graphic>
+                      <wp14:sizeRelH relativeFrom="margin">
+                        <wp14:pctWidth>0</wp14:pctWidth>
+                      </wp14:sizeRelH>
                       <wp14:sizeRelV relativeFrom="margin">
                         <wp14:pctHeight>0</wp14:pctHeight>
                       </wp14:sizeRelV>
@@ -891,23 +498,448 @@
                 </mc:Choice>
                 <mc:Fallback>
                   <w:pict>
-                    <v:roundrect w14:anchorId="7D4F80B1" id="Shape 4" o:spid="_x0000_s1026" style="position:absolute;left:0;text-align:left;margin-left:-225.1pt;margin-top:-102.35pt;width:310.6pt;height:59.3pt;z-index:9;visibility:visible;mso-wrap-style:square;mso-height-percent:0;mso-wrap-distance-left:.55pt;mso-wrap-distance-top:.55pt;mso-wrap-distance-right:.55pt;mso-wrap-distance-bottom:.55pt;mso-position-horizontal:absolute;mso-position-horizontal-relative:text;mso-position-vertical:absolute;mso-position-vertical-relative:text;mso-height-percent:0;mso-height-relative:margin;v-text-anchor:top" arcsize="10923f" o:gfxdata="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" o:allowincell="f" filled="f" strokeweight=".35mm">
-                      <v:textbox>
-                        <w:txbxContent>
-                          <w:p>
-                            <w:pPr>
-                              <w:rPr>
-                                <w:lang w:val="en-US"/>
-                              </w:rPr>
-                            </w:pPr>
-                          </w:p>
-                        </w:txbxContent>
-                      </v:textbox>
-                    </v:roundrect>
+                    <v:roundrect w14:anchorId="322911CD" id="Shape 1" o:spid="_x0000_s1026" style="position:absolute;margin-left:-.2pt;margin-top:12.4pt;width:231.8pt;height:54.15pt;z-index:10;visibility:visible;mso-wrap-style:square;mso-width-percent:0;mso-height-percent:0;mso-wrap-distance-left:.55pt;mso-wrap-distance-top:.55pt;mso-wrap-distance-right:.55pt;mso-wrap-distance-bottom:.55pt;mso-position-horizontal:absolute;mso-position-horizontal-relative:text;mso-position-vertical:absolute;mso-position-vertical-relative:text;mso-width-percent:0;mso-height-percent:0;mso-width-relative:margin;mso-height-relative:margin;v-text-anchor:top" arcsize="10923f" o:gfxdata="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" o:allowincell="f" filled="f" strokeweight=".35mm"/>
                   </w:pict>
                 </mc:Fallback>
               </mc:AlternateContent>
             </w:r>
+            <w:r>
+              <w:rPr>
+                <w:rFonts w:eastAsia="Times New Roman" w:cs="Times New Roman"/>
+                <w:color w:val="000000"/>
+              </w:rPr>
+              <w:t xml:space="preserve">                                       </w:t>
+            </w:r>
+          </w:p>
+          <w:p>
+            <w:pPr>
+              <w:pStyle w:val="LO-normal"/>
+              <w:rPr>
+                <w:rFonts w:eastAsia="Times New Roman" w:cs="Times New Roman"/>
+                <w:color w:val="000000"/>
+              </w:rPr>
+            </w:pPr>
+            <w:r>
+              <w:rPr>
+                <w:rFonts w:eastAsia="Times New Roman" w:cs="Times New Roman"/>
+                <w:color w:val="000000"/>
+              </w:rPr>
+              <w:t xml:space="preserve">        </w:t>
+            </w:r>
+          </w:p>
+          <w:p>
+            <w:pPr>
+              <w:pStyle w:val="LO-normal"/>
+              <w:rPr>
+                <w:rFonts w:eastAsia="Times New Roman" w:cs="Times New Roman"/>
+                <w:color w:val="000000"/>
+              </w:rPr>
+            </w:pPr>
+            <w:r>
+              <w:rPr>
+                <w:rFonts w:eastAsia="Times New Roman" w:cs="Times New Roman"/>
+                <w:color w:val="000000"/>
+              </w:rPr>
+              <w:t xml:space="preserve">    </w:t>
+            </w:r>
+            <w:r>
+              <w:rPr>
+                <w:rFonts w:eastAsia="Times New Roman" w:cs="Times New Roman"/>
+                <w:color w:val="000000"/>
+              </w:rPr>
+              <w:t xml:space="preserve">Nom de </w:t>
+            </w:r>
+            <w:proofErr w:type="spellStart"/>
+            <w:r>
+              <w:rPr>
+                <w:rFonts w:eastAsia="Times New Roman" w:cs="Times New Roman"/>
+                <w:color w:val="000000"/>
+              </w:rPr>
+              <w:t>L’</w:t>
+            </w:r>
+            <w:r>
+              <w:rPr>
+                <w:rFonts w:eastAsia="Times New Roman" w:cs="Times New Roman"/>
+                <w:color w:val="000000"/>
+              </w:rPr>
+              <w:t>entreprise</w:t>
+            </w:r>
+            <w:proofErr w:type="spellEnd"/>
+            <w:r>
+              <w:rPr>
+                <w:rFonts w:eastAsia="Times New Roman" w:cs="Times New Roman"/>
+                <w:color w:val="000000"/>
+              </w:rPr>
+              <w:t>:</w:t>
+            </w:r>
+            <w:r>
+              <w:rPr>
+                <w:rFonts w:eastAsia="Times New Roman" w:cs="Times New Roman"/>
+                <w:color w:val="000000"/>
+              </w:rPr>
+              <w:t xml:space="preserve"> </w:t>
+            </w:r>
+            <w:proofErr w:type="spellStart"/>
+            <w:r>
+              <w:rPr>
+                <w:rFonts w:eastAsia="Times New Roman" w:cs="Times New Roman"/>
+                <w:color w:val="000000"/>
+              </w:rPr>
+              <w:t>firm_name</w:t>
+            </w:r>
+            <w:proofErr w:type="spellEnd"/>
+          </w:p>
+          <w:p>
+            <w:pPr>
+              <w:pStyle w:val="LO-normal"/>
+              <w:rPr>
+                <w:rFonts w:eastAsia="Times New Roman" w:cs="Times New Roman"/>
+                <w:color w:val="000000"/>
+              </w:rPr>
+            </w:pPr>
+            <w:r>
+              <w:rPr>
+                <w:rFonts w:eastAsia="Times New Roman" w:cs="Times New Roman"/>
+                <w:color w:val="000000"/>
+              </w:rPr>
+              <w:t xml:space="preserve">    </w:t>
+            </w:r>
+            <w:r>
+              <w:rPr>
+                <w:rFonts w:eastAsia="Times New Roman" w:cs="Times New Roman"/>
+                <w:color w:val="000000"/>
+              </w:rPr>
+              <w:t xml:space="preserve">Address: </w:t>
+            </w:r>
+            <w:r>
+              <w:rPr>
+                <w:rFonts w:eastAsia="Times New Roman" w:cs="Times New Roman"/>
+                <w:color w:val="000000"/>
+              </w:rPr>
+              <w:t>address</w:t>
+            </w:r>
+          </w:p>
+          <w:p>
+            <w:pPr>
+              <w:pStyle w:val="LO-normal"/>
+              <w:rPr>
+                <w:rFonts w:eastAsia="Times New Roman" w:cs="Times New Roman"/>
+                <w:color w:val="000000"/>
+              </w:rPr>
+            </w:pPr>
+          </w:p>
+          <w:p>
+            <w:pPr>
+              <w:pStyle w:val="LO-normal"/>
+              <w:rPr>
+                <w:rFonts w:eastAsia="Times New Roman" w:cs="Times New Roman"/>
+                <w:color w:val="000000"/>
+              </w:rPr>
+            </w:pPr>
+            <w:r>
+              <w:rPr>
+                <w:rFonts w:eastAsia="Times New Roman" w:cs="Times New Roman"/>
+                <w:color w:val="000000"/>
+              </w:rPr>
+              <w:t xml:space="preserve">                           </w:t>
+            </w:r>
+          </w:p>
+        </w:tc>
+      </w:tr>
+    </w:tbl>
+    <w:p>
+      <w:pPr>
+        <w:pStyle w:val="LO-normal"/>
+        <w:spacing w:after="120"/>
+        <w:rPr>
+          <w:rFonts w:eastAsia="Times New Roman" w:cs="Times New Roman"/>
+          <w:color w:val="000000"/>
+          <w:sz w:val="4"/>
+          <w:szCs w:val="4"/>
+        </w:rPr>
+      </w:pPr>
+    </w:p>
+    <w:tbl>
+      <w:tblPr>
+        <w:tblW w:w="11111" w:type="dxa"/>
+        <w:tblInd w:w="-771" w:type="dxa"/>
+        <w:tblLayout w:type="fixed"/>
+        <w:tblLook w:val="0000" w:firstRow="0" w:lastRow="0" w:firstColumn="0" w:lastColumn="0" w:noHBand="0" w:noVBand="0"/>
+      </w:tblPr>
+      <w:tblGrid>
+        <w:gridCol w:w="1622"/>
+        <w:gridCol w:w="2835"/>
+        <w:gridCol w:w="2410"/>
+        <w:gridCol w:w="1842"/>
+        <w:gridCol w:w="2402"/>
+      </w:tblGrid>
+      <w:tr>
+        <w:trPr>
+          <w:trHeight w:val="360"/>
+        </w:trPr>
+        <w:tc>
+          <w:tcPr>
+            <w:tcW w:w="1622" w:type="dxa"/>
+            <w:tcBorders>
+              <w:bottom w:val="single" w:sz="8" w:space="0" w:color="000000"/>
+            </w:tcBorders>
+            <w:shd w:val="clear" w:color="auto" w:fill="auto"/>
+            <w:vAlign w:val="center"/>
+          </w:tcPr>
+          <w:p>
+            <w:pPr>
+              <w:pStyle w:val="LO-normal"/>
+              <w:jc w:val="center"/>
+              <w:rPr>
+                <w:rFonts w:ascii="Arial" w:eastAsia="Arial" w:hAnsi="Arial" w:cs="Arial"/>
+                <w:color w:val="000000"/>
+                <w:sz w:val="16"/>
+                <w:szCs w:val="16"/>
+              </w:rPr>
+            </w:pPr>
+            <w:proofErr w:type="spellStart"/>
+            <w:r>
+              <w:rPr>
+                <w:rFonts w:ascii="Arial" w:eastAsia="Arial" w:hAnsi="Arial" w:cs="Arial"/>
+                <w:color w:val="000000"/>
+                <w:sz w:val="16"/>
+                <w:szCs w:val="16"/>
+              </w:rPr>
+              <w:t>Référence</w:t>
+            </w:r>
+            <w:proofErr w:type="spellEnd"/>
+          </w:p>
+        </w:tc>
+        <w:tc>
+          <w:tcPr>
+            <w:tcW w:w="2835" w:type="dxa"/>
+            <w:tcBorders>
+              <w:left w:val="single" w:sz="8" w:space="0" w:color="000000"/>
+              <w:bottom w:val="single" w:sz="8" w:space="0" w:color="000000"/>
+            </w:tcBorders>
+            <w:shd w:val="clear" w:color="auto" w:fill="auto"/>
+            <w:vAlign w:val="center"/>
+          </w:tcPr>
+          <w:p>
+            <w:pPr>
+              <w:pStyle w:val="LO-normal"/>
+              <w:jc w:val="center"/>
+              <w:rPr>
+                <w:rFonts w:ascii="Arial" w:eastAsia="Arial" w:hAnsi="Arial" w:cs="Arial"/>
+                <w:color w:val="000000"/>
+                <w:sz w:val="16"/>
+                <w:szCs w:val="16"/>
+              </w:rPr>
+            </w:pPr>
+            <w:proofErr w:type="spellStart"/>
+            <w:r>
+              <w:rPr>
+                <w:rFonts w:ascii="Arial" w:eastAsia="Arial" w:hAnsi="Arial" w:cs="Arial"/>
+                <w:color w:val="000000"/>
+                <w:sz w:val="16"/>
+                <w:szCs w:val="16"/>
+              </w:rPr>
+              <w:t>Désignation</w:t>
+            </w:r>
+            <w:proofErr w:type="spellEnd"/>
+          </w:p>
+        </w:tc>
+        <w:tc>
+          <w:tcPr>
+            <w:tcW w:w="2410" w:type="dxa"/>
+            <w:tcBorders>
+              <w:left w:val="single" w:sz="8" w:space="0" w:color="000000"/>
+              <w:bottom w:val="single" w:sz="8" w:space="0" w:color="000000"/>
+            </w:tcBorders>
+            <w:shd w:val="clear" w:color="auto" w:fill="auto"/>
+            <w:vAlign w:val="center"/>
+          </w:tcPr>
+          <w:p>
+            <w:pPr>
+              <w:pStyle w:val="LO-normal"/>
+              <w:jc w:val="center"/>
+              <w:rPr>
+                <w:rFonts w:ascii="Arial" w:eastAsia="Arial" w:hAnsi="Arial" w:cs="Arial"/>
+                <w:color w:val="000000"/>
+                <w:sz w:val="16"/>
+                <w:szCs w:val="16"/>
+              </w:rPr>
+            </w:pPr>
+            <w:proofErr w:type="spellStart"/>
+            <w:r>
+              <w:rPr>
+                <w:rFonts w:ascii="Arial" w:eastAsia="Arial" w:hAnsi="Arial" w:cs="Arial"/>
+                <w:color w:val="000000"/>
+                <w:sz w:val="16"/>
+                <w:szCs w:val="16"/>
+              </w:rPr>
+              <w:t>Quantit</w:t>
+            </w:r>
+            <w:r>
+              <w:rPr>
+                <w:rFonts w:ascii="Verdana" w:eastAsia="Verdana" w:hAnsi="Verdana" w:cs="Verdana"/>
+                <w:color w:val="000000"/>
+                <w:sz w:val="16"/>
+                <w:szCs w:val="16"/>
+              </w:rPr>
+              <w:t>é</w:t>
+            </w:r>
+            <w:proofErr w:type="spellEnd"/>
+          </w:p>
+        </w:tc>
+        <w:tc>
+          <w:tcPr>
+            <w:tcW w:w="1842" w:type="dxa"/>
+            <w:tcBorders>
+              <w:left w:val="single" w:sz="8" w:space="0" w:color="000000"/>
+              <w:bottom w:val="single" w:sz="8" w:space="0" w:color="000000"/>
+            </w:tcBorders>
+            <w:shd w:val="clear" w:color="auto" w:fill="auto"/>
+            <w:vAlign w:val="center"/>
+          </w:tcPr>
+          <w:p>
+            <w:pPr>
+              <w:pStyle w:val="LO-normal"/>
+              <w:jc w:val="center"/>
+              <w:rPr>
+                <w:rFonts w:ascii="Arial" w:eastAsia="Arial" w:hAnsi="Arial" w:cs="Arial"/>
+                <w:color w:val="000000"/>
+                <w:sz w:val="16"/>
+                <w:szCs w:val="16"/>
+              </w:rPr>
+            </w:pPr>
+            <w:r>
+              <w:rPr>
+                <w:rFonts w:ascii="Arial" w:eastAsia="Arial" w:hAnsi="Arial" w:cs="Arial"/>
+                <w:color w:val="000000"/>
+                <w:sz w:val="16"/>
+                <w:szCs w:val="16"/>
+              </w:rPr>
+              <w:t>P.U.TTC</w:t>
+            </w:r>
+          </w:p>
+        </w:tc>
+        <w:tc>
+          <w:tcPr>
+            <w:tcW w:w="2402" w:type="dxa"/>
+            <w:tcBorders>
+              <w:left w:val="single" w:sz="8" w:space="0" w:color="000000"/>
+              <w:bottom w:val="single" w:sz="8" w:space="0" w:color="000000"/>
+            </w:tcBorders>
+            <w:shd w:val="clear" w:color="auto" w:fill="auto"/>
+            <w:vAlign w:val="center"/>
+          </w:tcPr>
+          <w:p>
+            <w:pPr>
+              <w:pStyle w:val="LO-normal"/>
+              <w:jc w:val="center"/>
+              <w:rPr>
+                <w:rFonts w:ascii="Arial" w:eastAsia="Arial" w:hAnsi="Arial" w:cs="Arial"/>
+                <w:color w:val="000000"/>
+                <w:sz w:val="16"/>
+                <w:szCs w:val="16"/>
+              </w:rPr>
+            </w:pPr>
+            <w:proofErr w:type="spellStart"/>
+            <w:r>
+              <w:rPr>
+                <w:rFonts w:ascii="Arial" w:eastAsia="Arial" w:hAnsi="Arial" w:cs="Arial"/>
+                <w:color w:val="000000"/>
+                <w:sz w:val="16"/>
+                <w:szCs w:val="16"/>
+              </w:rPr>
+              <w:t>Montant</w:t>
+            </w:r>
+            <w:proofErr w:type="spellEnd"/>
+          </w:p>
+        </w:tc>
+      </w:tr>
+      <w:tr>
+        <w:trPr>
+          <w:trHeight w:val="7789"/>
+        </w:trPr>
+        <w:tc>
+          <w:tcPr>
+            <w:tcW w:w="1622" w:type="dxa"/>
+            <w:tcBorders>
+              <w:top w:val="single" w:sz="8" w:space="0" w:color="000000"/>
+              <w:bottom w:val="single" w:sz="8" w:space="0" w:color="000000"/>
+            </w:tcBorders>
+            <w:shd w:val="clear" w:color="auto" w:fill="auto"/>
+          </w:tcPr>
+          <w:p>
+            <w:pPr>
+              <w:pStyle w:val="LO-normal"/>
+              <w:jc w:val="center"/>
+              <w:rPr>
+                <w:rFonts w:ascii="Arial" w:eastAsia="Arial" w:hAnsi="Arial" w:cs="Arial"/>
+                <w:color w:val="000000"/>
+                <w:sz w:val="20"/>
+                <w:szCs w:val="20"/>
+              </w:rPr>
+            </w:pPr>
+            <w:r>
+              <w:rPr>
+                <w:rFonts w:ascii="Arial" w:eastAsia="Arial" w:hAnsi="Arial" w:cs="Arial"/>
+                <w:sz w:val="20"/>
+                <w:szCs w:val="20"/>
+              </w:rPr>
+              <w:t>reference</w:t>
+            </w:r>
+          </w:p>
+        </w:tc>
+        <w:tc>
+          <w:tcPr>
+            <w:tcW w:w="2835" w:type="dxa"/>
+            <w:tcBorders>
+              <w:top w:val="single" w:sz="8" w:space="0" w:color="000000"/>
+              <w:left w:val="single" w:sz="8" w:space="0" w:color="000000"/>
+              <w:bottom w:val="single" w:sz="8" w:space="0" w:color="000000"/>
+            </w:tcBorders>
+            <w:shd w:val="clear" w:color="auto" w:fill="auto"/>
+          </w:tcPr>
+          <w:p>
+            <w:pPr>
+              <w:pStyle w:val="LO-normal"/>
+              <w:jc w:val="center"/>
+              <w:rPr>
+                <w:rFonts w:ascii="Arial" w:eastAsia="Arial" w:hAnsi="Arial" w:cs="Arial"/>
+                <w:color w:val="000000"/>
+                <w:sz w:val="20"/>
+                <w:szCs w:val="20"/>
+              </w:rPr>
+            </w:pPr>
+            <w:r>
+              <w:rPr>
+                <w:rFonts w:ascii="Arial" w:eastAsia="Arial" w:hAnsi="Arial" w:cs="Arial"/>
+                <w:sz w:val="20"/>
+                <w:szCs w:val="20"/>
+              </w:rPr>
+              <w:t>destination</w:t>
+            </w:r>
+          </w:p>
+        </w:tc>
+        <w:tc>
+          <w:tcPr>
+            <w:tcW w:w="2410" w:type="dxa"/>
+            <w:tcBorders>
+              <w:top w:val="single" w:sz="8" w:space="0" w:color="000000"/>
+              <w:left w:val="single" w:sz="8" w:space="0" w:color="000000"/>
+              <w:bottom w:val="single" w:sz="8" w:space="0" w:color="000000"/>
+            </w:tcBorders>
+            <w:shd w:val="clear" w:color="auto" w:fill="auto"/>
+          </w:tcPr>
+          <w:p>
+            <w:pPr>
+              <w:pStyle w:val="LO-normal"/>
+              <w:jc w:val="center"/>
+              <w:rPr>
+                <w:rFonts w:ascii="Arial" w:eastAsia="Arial" w:hAnsi="Arial" w:cs="Arial"/>
+                <w:color w:val="000000"/>
+                <w:sz w:val="20"/>
+                <w:szCs w:val="20"/>
+              </w:rPr>
+            </w:pPr>
             <w:r>
               <w:rPr>
                 <w:rFonts w:ascii="Arial" w:eastAsia="Arial" w:hAnsi="Arial" w:cs="Arial"/>
@@ -1227,7 +1259,15 @@
                 <w:sz w:val="20"/>
                 <w:szCs w:val="20"/>
               </w:rPr>
-              <w:t>total_ht</w:t>
+              <w:t>tax</w:t>
+            </w:r>
+            <w:r>
+              <w:rPr>
+                <w:rFonts w:ascii="Arial" w:eastAsia="Arial" w:hAnsi="Arial" w:cs="Arial"/>
+                <w:sz w:val="20"/>
+                <w:szCs w:val="20"/>
+              </w:rPr>
+              <w:t>_ht</w:t>
             </w:r>
             <w:proofErr w:type="spellEnd"/>
           </w:p>
@@ -1373,6 +1413,19 @@
         </w:tc>
       </w:tr>
     </w:tbl>
+    <w:p>
+      <w:pPr>
+        <w:pStyle w:val="FrameContents"/>
+        <w:spacing w:line="240" w:lineRule="exact"/>
+        <w:rPr>
+          <w:rFonts w:ascii="Arial" w:eastAsia="Arial" w:hAnsi="Arial" w:cs="Arial"/>
+          <w:b/>
+          <w:iCs/>
+          <w:color w:val="000000"/>
+          <w:sz w:val="21"/>
+        </w:rPr>
+      </w:pPr>
+    </w:p>
     <w:p>
       <w:pPr>
         <w:pStyle w:val="FrameContents"/>

</xml_diff>

<commit_message>
version 0.0.41 added fix for created_date and when user see form with number_facture
</commit_message>
<xml_diff>
--- a/apps/facture/static/facture/file_templates/file_input/Facture_template_Maroc.docx
+++ b/apps/facture/static/facture/file_templates/file_input/Facture_template_Maroc.docx
@@ -111,10 +111,10 @@
                     <wp:anchor distT="6985" distB="6985" distL="6985" distR="6985" simplePos="0" relativeHeight="251659264" behindDoc="0" locked="0" layoutInCell="0" allowOverlap="1" wp14:anchorId="7B12CB09" wp14:editId="1B04067E">
                       <wp:simplePos x="0" y="0"/>
                       <wp:positionH relativeFrom="column">
-                        <wp:posOffset>8825</wp:posOffset>
+                        <wp:posOffset>8255</wp:posOffset>
                       </wp:positionH>
                       <wp:positionV relativeFrom="paragraph">
-                        <wp:posOffset>79893</wp:posOffset>
+                        <wp:posOffset>29495</wp:posOffset>
                       </wp:positionV>
                       <wp:extent cx="3909527" cy="821094"/>
                       <wp:effectExtent l="0" t="0" r="15240" b="17145"/>
@@ -170,7 +170,7 @@
                 </mc:Choice>
                 <mc:Fallback>
                   <w:pict>
-                    <v:roundrect w14:anchorId="1301AAED" id="Shape 1" o:spid="_x0000_s1026" style="position:absolute;margin-left:.7pt;margin-top:6.3pt;width:307.85pt;height:64.65pt;z-index:251659264;visibility:visible;mso-wrap-style:square;mso-width-percent:0;mso-height-percent:0;mso-wrap-distance-left:.55pt;mso-wrap-distance-top:.55pt;mso-wrap-distance-right:.55pt;mso-wrap-distance-bottom:.55pt;mso-position-horizontal:absolute;mso-position-horizontal-relative:text;mso-position-vertical:absolute;mso-position-vertical-relative:text;mso-width-percent:0;mso-height-percent:0;mso-width-relative:margin;mso-height-relative:margin;v-text-anchor:top" arcsize="10923f" o:gfxdata="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" o:allowincell="f" filled="f" strokeweight=".35mm"/>
+                    <v:roundrect w14:anchorId="472A7D8F" id="Shape 1" o:spid="_x0000_s1026" style="position:absolute;margin-left:.65pt;margin-top:2.3pt;width:307.85pt;height:64.65pt;z-index:251659264;visibility:visible;mso-wrap-style:square;mso-width-percent:0;mso-height-percent:0;mso-wrap-distance-left:.55pt;mso-wrap-distance-top:.55pt;mso-wrap-distance-right:.55pt;mso-wrap-distance-bottom:.55pt;mso-position-horizontal:absolute;mso-position-horizontal-relative:text;mso-position-vertical:absolute;mso-position-vertical-relative:text;mso-width-percent:0;mso-height-percent:0;mso-width-relative:margin;mso-height-relative:margin;v-text-anchor:top" arcsize="10923f" o:gfxdata="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" o:allowincell="f" filled="f" strokeweight=".35mm"/>
                   </w:pict>
                 </mc:Fallback>
               </mc:AlternateContent>
@@ -348,6 +348,15 @@
                       <w:szCs w:val="20"/>
                     </w:rPr>
                   </w:pPr>
+                  <w:proofErr w:type="spellStart"/>
+                  <w:r>
+                    <w:rPr>
+                      <w:rFonts w:ascii="Arial" w:eastAsia="Arial" w:hAnsi="Arial" w:cs="Arial"/>
+                      <w:sz w:val="20"/>
+                      <w:szCs w:val="20"/>
+                    </w:rPr>
+                    <w:t>created_</w:t>
+                  </w:r>
                   <w:r>
                     <w:rPr>
                       <w:rFonts w:ascii="Arial" w:eastAsia="Arial" w:hAnsi="Arial" w:cs="Arial"/>
@@ -356,6 +365,7 @@
                     </w:rPr>
                     <w:t>date</w:t>
                   </w:r>
+                  <w:proofErr w:type="spellEnd"/>
                 </w:p>
               </w:tc>
               <w:tc>

</xml_diff>